<commit_message>
Change protocol add remove tamplte
</commit_message>
<xml_diff>
--- a/backend/Protocol_add_remove_template.docx
+++ b/backend/Protocol_add_remove_template.docx
@@ -1682,9 +1682,9 @@
         <w:tblLook w:val="04A0" w:firstRow="1" w:lastRow="0" w:firstColumn="1" w:lastColumn="0" w:noHBand="0" w:noVBand="1"/>
       </w:tblPr>
       <w:tblGrid>
-        <w:gridCol w:w="2393"/>
-        <w:gridCol w:w="3268"/>
-        <w:gridCol w:w="4796"/>
+        <w:gridCol w:w="1917"/>
+        <w:gridCol w:w="3451"/>
+        <w:gridCol w:w="5089"/>
       </w:tblGrid>
       <w:tr>
         <w:tc>
@@ -1695,6 +1695,11 @@
           </w:tcPr>
           <w:p>
             <w:pPr>
+              <w:pStyle w:val="a3"/>
+              <w:numPr>
+                <w:ilvl w:val="0"/>
+                <w:numId w:val="10"/>
+              </w:numPr>
               <w:tabs>
                 <w:tab w:val="left" w:pos="360"/>
                 <w:tab w:val="left" w:pos="567"/>
@@ -1708,24 +1713,7 @@
               <w:rPr>
                 <w:lang w:val="en-US"/>
               </w:rPr>
-              <w:t>{#</w:t>
-            </w:r>
-            <w:proofErr w:type="gramStart"/>
-            <w:r>
-              <w:rPr>
-                <w:lang w:val="en-US"/>
-              </w:rPr>
-              <w:t>employee}</w:t>
-            </w:r>
-            <w:r>
-              <w:t>{</w:t>
-            </w:r>
-            <w:proofErr w:type="gramEnd"/>
-            <w:r>
-              <w:rPr>
-                <w:lang w:val="en-US"/>
-              </w:rPr>
-              <w:t>@index+1</w:t>
+              <w:t>{#employee</w:t>
             </w:r>
             <w:r>
               <w:rPr>
@@ -2019,7 +2007,7 @@
   <w:abstractNum w:abstractNumId="0" w15:restartNumberingAfterBreak="0">
     <w:nsid w:val="1AEE5245"/>
     <w:multiLevelType w:val="hybridMultilevel"/>
-    <w:tmpl w:val="C838C85A"/>
+    <w:tmpl w:val="C7629716"/>
     <w:lvl w:ilvl="0" w:tplc="0419000F">
       <w:start w:val="1"/>
       <w:numFmt w:val="decimal"/>
@@ -2447,6 +2435,92 @@
     </w:lvl>
   </w:abstractNum>
   <w:abstractNum w:abstractNumId="5" w15:restartNumberingAfterBreak="0">
+    <w:nsid w:val="59FC5282"/>
+    <w:multiLevelType w:val="hybridMultilevel"/>
+    <w:tmpl w:val="C7629716"/>
+    <w:lvl w:ilvl="0" w:tplc="FFFFFFFF">
+      <w:start w:val="1"/>
+      <w:numFmt w:val="decimal"/>
+      <w:lvlText w:val="%1."/>
+      <w:lvlJc w:val="left"/>
+      <w:pPr>
+        <w:ind w:left="720" w:hanging="360"/>
+      </w:pPr>
+    </w:lvl>
+    <w:lvl w:ilvl="1" w:tplc="FFFFFFFF" w:tentative="1">
+      <w:start w:val="1"/>
+      <w:numFmt w:val="lowerLetter"/>
+      <w:lvlText w:val="%2."/>
+      <w:lvlJc w:val="left"/>
+      <w:pPr>
+        <w:ind w:left="1440" w:hanging="360"/>
+      </w:pPr>
+    </w:lvl>
+    <w:lvl w:ilvl="2" w:tplc="FFFFFFFF" w:tentative="1">
+      <w:start w:val="1"/>
+      <w:numFmt w:val="lowerRoman"/>
+      <w:lvlText w:val="%3."/>
+      <w:lvlJc w:val="right"/>
+      <w:pPr>
+        <w:ind w:left="2160" w:hanging="180"/>
+      </w:pPr>
+    </w:lvl>
+    <w:lvl w:ilvl="3" w:tplc="FFFFFFFF" w:tentative="1">
+      <w:start w:val="1"/>
+      <w:numFmt w:val="decimal"/>
+      <w:lvlText w:val="%4."/>
+      <w:lvlJc w:val="left"/>
+      <w:pPr>
+        <w:ind w:left="2880" w:hanging="360"/>
+      </w:pPr>
+    </w:lvl>
+    <w:lvl w:ilvl="4" w:tplc="FFFFFFFF" w:tentative="1">
+      <w:start w:val="1"/>
+      <w:numFmt w:val="lowerLetter"/>
+      <w:lvlText w:val="%5."/>
+      <w:lvlJc w:val="left"/>
+      <w:pPr>
+        <w:ind w:left="3600" w:hanging="360"/>
+      </w:pPr>
+    </w:lvl>
+    <w:lvl w:ilvl="5" w:tplc="FFFFFFFF" w:tentative="1">
+      <w:start w:val="1"/>
+      <w:numFmt w:val="lowerRoman"/>
+      <w:lvlText w:val="%6."/>
+      <w:lvlJc w:val="right"/>
+      <w:pPr>
+        <w:ind w:left="4320" w:hanging="180"/>
+      </w:pPr>
+    </w:lvl>
+    <w:lvl w:ilvl="6" w:tplc="FFFFFFFF" w:tentative="1">
+      <w:start w:val="1"/>
+      <w:numFmt w:val="decimal"/>
+      <w:lvlText w:val="%7."/>
+      <w:lvlJc w:val="left"/>
+      <w:pPr>
+        <w:ind w:left="5040" w:hanging="360"/>
+      </w:pPr>
+    </w:lvl>
+    <w:lvl w:ilvl="7" w:tplc="FFFFFFFF" w:tentative="1">
+      <w:start w:val="1"/>
+      <w:numFmt w:val="lowerLetter"/>
+      <w:lvlText w:val="%8."/>
+      <w:lvlJc w:val="left"/>
+      <w:pPr>
+        <w:ind w:left="5760" w:hanging="360"/>
+      </w:pPr>
+    </w:lvl>
+    <w:lvl w:ilvl="8" w:tplc="FFFFFFFF" w:tentative="1">
+      <w:start w:val="1"/>
+      <w:numFmt w:val="lowerRoman"/>
+      <w:lvlText w:val="%9."/>
+      <w:lvlJc w:val="right"/>
+      <w:pPr>
+        <w:ind w:left="6480" w:hanging="180"/>
+      </w:pPr>
+    </w:lvl>
+  </w:abstractNum>
+  <w:abstractNum w:abstractNumId="6" w15:restartNumberingAfterBreak="0">
     <w:nsid w:val="5E2A2C94"/>
     <w:multiLevelType w:val="hybridMultilevel"/>
     <w:tmpl w:val="6FE03D1A"/>
@@ -2532,7 +2606,7 @@
       </w:pPr>
     </w:lvl>
   </w:abstractNum>
-  <w:abstractNum w:abstractNumId="6" w15:restartNumberingAfterBreak="0">
+  <w:abstractNum w:abstractNumId="7" w15:restartNumberingAfterBreak="0">
     <w:nsid w:val="66E415C7"/>
     <w:multiLevelType w:val="hybridMultilevel"/>
     <w:tmpl w:val="6FE03D1A"/>
@@ -2618,7 +2692,7 @@
       </w:pPr>
     </w:lvl>
   </w:abstractNum>
-  <w:abstractNum w:abstractNumId="7" w15:restartNumberingAfterBreak="0">
+  <w:abstractNum w:abstractNumId="8" w15:restartNumberingAfterBreak="0">
     <w:nsid w:val="676C6EC0"/>
     <w:multiLevelType w:val="hybridMultilevel"/>
     <w:tmpl w:val="6FE03D1A"/>
@@ -2704,7 +2778,7 @@
       </w:pPr>
     </w:lvl>
   </w:abstractNum>
-  <w:abstractNum w:abstractNumId="8" w15:restartNumberingAfterBreak="0">
+  <w:abstractNum w:abstractNumId="9" w15:restartNumberingAfterBreak="0">
     <w:nsid w:val="78D43B4F"/>
     <w:multiLevelType w:val="hybridMultilevel"/>
     <w:tmpl w:val="99640E4C"/>
@@ -2794,13 +2868,13 @@
     </w:lvl>
   </w:abstractNum>
   <w:num w:numId="1" w16cid:durableId="1060522238">
-    <w:abstractNumId w:val="8"/>
+    <w:abstractNumId w:val="9"/>
   </w:num>
   <w:num w:numId="2" w16cid:durableId="2082557995">
     <w:abstractNumId w:val="1"/>
   </w:num>
   <w:num w:numId="3" w16cid:durableId="1508207785">
-    <w:abstractNumId w:val="6"/>
+    <w:abstractNumId w:val="7"/>
   </w:num>
   <w:num w:numId="4" w16cid:durableId="1112287240">
     <w:abstractNumId w:val="3"/>
@@ -2809,16 +2883,19 @@
     <w:abstractNumId w:val="2"/>
   </w:num>
   <w:num w:numId="6" w16cid:durableId="1308900397">
-    <w:abstractNumId w:val="5"/>
+    <w:abstractNumId w:val="6"/>
   </w:num>
   <w:num w:numId="7" w16cid:durableId="1130712443">
     <w:abstractNumId w:val="4"/>
   </w:num>
   <w:num w:numId="8" w16cid:durableId="123012430">
-    <w:abstractNumId w:val="7"/>
+    <w:abstractNumId w:val="8"/>
   </w:num>
   <w:num w:numId="9" w16cid:durableId="1479955585">
     <w:abstractNumId w:val="0"/>
+  </w:num>
+  <w:num w:numId="10" w16cid:durableId="423455782">
+    <w:abstractNumId w:val="5"/>
   </w:num>
 </w:numbering>
 </file>

</xml_diff>